<commit_message>
sua bang cau hoi v2
</commit_message>
<xml_diff>
--- a/Nhom10_REPORT_ApplicationDevelopment.docx
+++ b/Nhom10_REPORT_ApplicationDevelopment.docx
@@ -127,7 +127,7 @@
           </mc:Choice>
           <mc:Fallback>
             <w:pict>
-              <v:shapetype w14:anchorId="3143F7B6" id="_x0000_t32" coordsize="21600,21600" o:spt="32" o:oned="t" path="m,l21600,21600e" filled="f">
+              <v:shapetype w14:anchorId="476FD905" id="_x0000_t32" coordsize="21600,21600" o:spt="32" o:oned="t" path="m,l21600,21600e" filled="f">
                 <v:path arrowok="t" fillok="f" o:connecttype="none"/>
                 <o:lock v:ext="edit" shapetype="t"/>
               </v:shapetype>
@@ -8001,8 +8001,17 @@
               <w:rPr>
                 <w:szCs w:val="26"/>
               </w:rPr>
-              <w:t>Liên quan đến cấu trúc lưu trữ dữ liệu. Tôi đề xuất mỗi thú cưng sẽ có một "Mã thú cưng" (Pet_ID) liên kết trực tiếp với "Mã khách hàng" (Customer_ID). Khi nhân viên nhập Số điện thoại để tra cứu, hệ thống sẽ hiển thị thông tin Khách hàng đó kèm theo danh sách tất cả thú cưng của họ. Đề xuất này có đúng với nghiệp vụ không? Mong cô giúp đỡ.</w:t>
-            </w:r>
+              <w:t xml:space="preserve">Liên quan đến cấu trúc lưu trữ dữ liệu. Tôi đề xuất mỗi thú cưng sẽ có một "Mã thú cưng" (Pet_ID) liên kết trực tiếp với "Mã khách hàng" (Customer_ID). Khi nhân viên nhập Số điện thoại để tra cứu, hệ thống sẽ hiển thị thông tin Khách hàng đó kèm theo danh sách tất cả thú cưng của họ. Đề xuất này có đúng với nghiệp vụ không? </w:t>
+            </w:r>
+          </w:p>
+          <w:p>
+            <w:pPr>
+              <w:spacing w:after="120"/>
+              <w:ind w:firstLine="0"/>
+              <w:rPr>
+                <w:szCs w:val="26"/>
+              </w:rPr>
+            </w:pPr>
           </w:p>
         </w:tc>
         <w:tc>
@@ -8022,6 +8031,7 @@
               <w:rPr>
                 <w:szCs w:val="26"/>
               </w:rPr>
+              <w:lastRenderedPageBreak/>
               <w:t>Đúng nghiệp vụ. Một khách hàng có thể nuôi nhiều thú cưng. Việc dùng Số điện thoại làm từ khóa tra cứu thông tin là rất thực tế.</w:t>
             </w:r>
           </w:p>
@@ -8093,7 +8103,6 @@
               <w:rPr>
                 <w:sz w:val="24"/>
               </w:rPr>
-              <w:lastRenderedPageBreak/>
               <w:t>5.</w:t>
             </w:r>
           </w:p>
@@ -8244,14 +8253,7 @@
               <w:rPr>
                 <w:szCs w:val="26"/>
               </w:rPr>
-              <w:t xml:space="preserve">- Thiết kế bảng Invoice (Hóa đơn) trong CSDL linh hoạt để chứa và phân biệt được cả 2 loại mã Dịch vụ và Phụ </w:t>
-            </w:r>
-            <w:proofErr w:type="gramStart"/>
-            <w:r>
-              <w:rPr>
-                <w:szCs w:val="26"/>
-              </w:rPr>
-              <w:t>kiện.</w:t>
+              <w:t>- Thiết kế bảng Invoice (Hóa đơn) trong CSDL linh hoạt để chứa và phân biệt được cả 2 loại mã Dịch vụ và Phụ kiện.</w:t>
             </w:r>
             <w:r>
               <w:rPr>
@@ -8259,7 +8261,6 @@
               </w:rPr>
               <w:t>.</w:t>
             </w:r>
-            <w:proofErr w:type="gramEnd"/>
           </w:p>
         </w:tc>
       </w:tr>
@@ -8304,14 +8305,14 @@
               <w:rPr>
                 <w:szCs w:val="26"/>
               </w:rPr>
-              <w:t xml:space="preserve">Liên quan đến tính toàn vẹn dữ liệu. Khi một hóa đơn đã lưu vào DB, tôi hiểu là không được phép "Xóa" cứng (Delete). Nếu sai sót, Nhân viên chỉ được thao tác đổi trạng thái thành "Đã </w:t>
+              <w:t xml:space="preserve">Liên quan đến tính toàn vẹn dữ liệu. Khi một hóa đơn đã lưu vào DB, tôi hiểu là không được phép "Xóa" cứng (Delete). Nếu sai sót, Nhân viên chỉ được thao tác đổi </w:t>
             </w:r>
             <w:r>
               <w:rPr>
                 <w:szCs w:val="26"/>
               </w:rPr>
               <w:lastRenderedPageBreak/>
-              <w:t>hủy" dưới sự phê duyệt của Chủ cửa hàng. Tôi hiểu như vậy có đúng không?</w:t>
+              <w:t>trạng thái thành "Đã hủy" dưới sự phê duyệt của Chủ cửa hàng. Tôi hiểu như vậy có đúng không?</w:t>
             </w:r>
           </w:p>
         </w:tc>
@@ -8657,6 +8658,7 @@
           <w:bCs/>
           <w:szCs w:val="26"/>
         </w:rPr>
+        <w:lastRenderedPageBreak/>
         <w:t xml:space="preserve">Thông tin dịch vụ chăm sóc: </w:t>
       </w:r>
       <w:r>
@@ -8683,7 +8685,6 @@
           <w:bCs/>
           <w:szCs w:val="26"/>
         </w:rPr>
-        <w:lastRenderedPageBreak/>
         <w:t xml:space="preserve">Thông tin lịch hẹn: </w:t>
       </w:r>
       <w:r>
@@ -8939,7 +8940,14 @@
         <w:rPr>
           <w:szCs w:val="26"/>
         </w:rPr>
-        <w:t>Hệ thống cho phép người dùng có quyền phù hợp thêm mới, cập nhật và tra cứu thông tin sản phẩm được kinh doanh tại cửa hàng. Chức năng này hỗ trợ quản lý các sản phẩm phục vụ hoạt động bán hàng và theo dõi tình trạng hàng hóa</w:t>
+        <w:t xml:space="preserve">Hệ thống cho phép người dùng có quyền phù hợp thêm mới, cập nhật và tra cứu thông tin sản phẩm được kinh doanh tại cửa </w:t>
+      </w:r>
+      <w:r>
+        <w:rPr>
+          <w:szCs w:val="26"/>
+        </w:rPr>
+        <w:lastRenderedPageBreak/>
+        <w:t>hàng. Chức năng này hỗ trợ quản lý các sản phẩm phục vụ hoạt động bán hàng và theo dõi tình trạng hàng hóa</w:t>
       </w:r>
       <w:r>
         <w:rPr>
@@ -8965,7 +8973,6 @@
           <w:bCs/>
           <w:szCs w:val="26"/>
         </w:rPr>
-        <w:lastRenderedPageBreak/>
         <w:t xml:space="preserve">Quản lý tồn kho: </w:t>
       </w:r>
       <w:r>
@@ -9191,6 +9198,7 @@
         <w:rPr>
           <w:szCs w:val="26"/>
         </w:rPr>
+        <w:lastRenderedPageBreak/>
         <w:t>Thời gian mở các màn hình chức năng chính không vượt quá 3 giây kể từ khi người dùng thực hiện thao tác truy cập</w:t>
       </w:r>
       <w:r>
@@ -9209,7 +9217,6 @@
         <w:rPr>
           <w:szCs w:val="26"/>
         </w:rPr>
-        <w:lastRenderedPageBreak/>
         <w:t>Khi lập hóa đơn, hệ thống phải hoàn thành việc lưu hóa đơn và cập nhật tồn kho trong cùng một giao dịch cơ sở dữ liệu, với thời gian xử lý không vượt quá 3 giây trong điều kiện dữ liệu hợp lệ</w:t>
       </w:r>
       <w:r>
@@ -9381,13 +9388,8 @@
         <w:pStyle w:val="Heading3"/>
       </w:pPr>
       <w:bookmarkStart w:id="27" w:name="_Toc240195155"/>
-      <w:proofErr w:type="gramStart"/>
-      <w:r>
-        <w:t>An</w:t>
-      </w:r>
-      <w:proofErr w:type="gramEnd"/>
-      <w:r>
-        <w:t xml:space="preserve"> toàn thông tin</w:t>
+      <w:r>
+        <w:t>An toàn thông tin</w:t>
       </w:r>
       <w:bookmarkEnd w:id="27"/>
     </w:p>
@@ -13738,16 +13740,8 @@
               <w:rPr>
                 <w:sz w:val="24"/>
               </w:rPr>
-              <w:t>Phát sinh day số theo quy luật</w:t>
-            </w:r>
-            <w:proofErr w:type="gramStart"/>
-            <w:r>
-              <w:rPr>
-                <w:sz w:val="24"/>
-              </w:rPr>
-              <w:t>…..</w:t>
-            </w:r>
-            <w:proofErr w:type="gramEnd"/>
+              <w:t>Phát sinh day số theo quy luật…..</w:t>
+            </w:r>
           </w:p>
         </w:tc>
         <w:tc>
@@ -14974,7 +14968,7 @@
           <w:noProof/>
         </w:rPr>
         <w:drawing>
-          <wp:inline distT="0" distB="0" distL="0" distR="0" wp14:anchorId="7BB8721A" wp14:editId="4D8913FB">
+          <wp:inline distT="0" distB="0" distL="0" distR="0" wp14:anchorId="7BB8721A" wp14:editId="2ED2F37B">
             <wp:extent cx="1639614" cy="589327"/>
             <wp:effectExtent l="0" t="0" r="0" b="0"/>
             <wp:docPr id="972141918" name="Picture 1"/>
@@ -15205,7 +15199,7 @@
           </mc:Choice>
           <mc:Fallback>
             <w:pict>
-              <v:rect w14:anchorId="0AD09EA3" id="Rectangle 10" o:spid="_x0000_s1026" style="position:absolute;margin-left:9.95pt;margin-top:157.05pt;width:47.5pt;height:19pt;z-index:251666432;visibility:visible;mso-wrap-style:square;mso-height-percent:0;mso-wrap-distance-left:9pt;mso-wrap-distance-top:0;mso-wrap-distance-right:9pt;mso-wrap-distance-bottom:0;mso-position-horizontal:absolute;mso-position-horizontal-relative:text;mso-position-vertical:absolute;mso-position-vertical-relative:text;mso-height-percent:0;mso-height-relative:margin;v-text-anchor:middle" o:gfxdata="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" fillcolor="#fabf8f [1945]" strokecolor="#243f60 [1604]" strokeweight="2pt"/>
+              <v:rect w14:anchorId="3D1F0156" id="Rectangle 10" o:spid="_x0000_s1026" style="position:absolute;margin-left:9.95pt;margin-top:157.05pt;width:47.5pt;height:19pt;z-index:251666432;visibility:visible;mso-wrap-style:square;mso-height-percent:0;mso-wrap-distance-left:9pt;mso-wrap-distance-top:0;mso-wrap-distance-right:9pt;mso-wrap-distance-bottom:0;mso-position-horizontal:absolute;mso-position-horizontal-relative:text;mso-position-vertical:absolute;mso-position-vertical-relative:text;mso-height-percent:0;mso-height-relative:margin;v-text-anchor:middle" o:gfxdata="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" fillcolor="#fabf8f [1945]" strokecolor="#243f60 [1604]" strokeweight="2pt"/>
             </w:pict>
           </mc:Fallback>
         </mc:AlternateContent>
@@ -15279,7 +15273,7 @@
           </mc:Choice>
           <mc:Fallback>
             <w:pict>
-              <v:rect w14:anchorId="2F898442" id="Rectangle 11" o:spid="_x0000_s1026" style="position:absolute;margin-left:10.25pt;margin-top:180.3pt;width:47.5pt;height:19pt;z-index:251667456;visibility:visible;mso-wrap-style:square;mso-height-percent:0;mso-wrap-distance-left:9pt;mso-wrap-distance-top:0;mso-wrap-distance-right:9pt;mso-wrap-distance-bottom:0;mso-position-horizontal:absolute;mso-position-horizontal-relative:text;mso-position-vertical:absolute;mso-position-vertical-relative:text;mso-height-percent:0;mso-height-relative:margin;v-text-anchor:middle" o:gfxdata="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" fillcolor="#c00000" strokecolor="#243f60 [1604]" strokeweight="2pt"/>
+              <v:rect w14:anchorId="61ACB3C6" id="Rectangle 11" o:spid="_x0000_s1026" style="position:absolute;margin-left:10.25pt;margin-top:180.3pt;width:47.5pt;height:19pt;z-index:251667456;visibility:visible;mso-wrap-style:square;mso-height-percent:0;mso-wrap-distance-left:9pt;mso-wrap-distance-top:0;mso-wrap-distance-right:9pt;mso-wrap-distance-bottom:0;mso-position-horizontal:absolute;mso-position-horizontal-relative:text;mso-position-vertical:absolute;mso-position-vertical-relative:text;mso-height-percent:0;mso-height-relative:margin;v-text-anchor:middle" o:gfxdata="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" fillcolor="#c00000" strokecolor="#243f60 [1604]" strokeweight="2pt"/>
             </w:pict>
           </mc:Fallback>
         </mc:AlternateContent>
@@ -15355,7 +15349,7 @@
           </mc:Choice>
           <mc:Fallback>
             <w:pict>
-              <v:rect w14:anchorId="7800454B" id="Rectangle 13" o:spid="_x0000_s1026" style="position:absolute;margin-left:10.3pt;margin-top:130.8pt;width:47.55pt;height:19pt;z-index:251668480;visibility:visible;mso-wrap-style:square;mso-height-percent:0;mso-wrap-distance-left:9pt;mso-wrap-distance-top:0;mso-wrap-distance-right:9pt;mso-wrap-distance-bottom:0;mso-position-horizontal:absolute;mso-position-horizontal-relative:text;mso-position-vertical:absolute;mso-position-vertical-relative:text;mso-height-percent:0;mso-height-relative:margin;v-text-anchor:middle" o:gfxdata="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" fillcolor="#365f91 [2404]" strokecolor="#243f60 [1604]" strokeweight="2pt"/>
+              <v:rect w14:anchorId="337999A9" id="Rectangle 13" o:spid="_x0000_s1026" style="position:absolute;margin-left:10.3pt;margin-top:130.8pt;width:47.55pt;height:19pt;z-index:251668480;visibility:visible;mso-wrap-style:square;mso-height-percent:0;mso-wrap-distance-left:9pt;mso-wrap-distance-top:0;mso-wrap-distance-right:9pt;mso-wrap-distance-bottom:0;mso-position-horizontal:absolute;mso-position-horizontal-relative:text;mso-position-vertical:absolute;mso-position-vertical-relative:text;mso-height-percent:0;mso-height-relative:margin;v-text-anchor:middle" o:gfxdata="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" fillcolor="#365f91 [2404]" strokecolor="#243f60 [1604]" strokeweight="2pt"/>
             </w:pict>
           </mc:Fallback>
         </mc:AlternateContent>
@@ -15605,7 +15599,7 @@
           </mc:Choice>
           <mc:Fallback>
             <w:pict>
-              <v:rect w14:anchorId="2927D608" id="Rectangle 14" o:spid="_x0000_s1026" style="position:absolute;margin-left:127.45pt;margin-top:90.65pt;width:189.9pt;height:73.9pt;z-index:251664384;visibility:visible;mso-wrap-style:square;mso-wrap-distance-left:9pt;mso-wrap-distance-top:0;mso-wrap-distance-right:9pt;mso-wrap-distance-bottom:0;mso-position-horizontal:absolute;mso-position-horizontal-relative:text;mso-position-vertical:absolute;mso-position-vertical-relative:text;v-text-anchor:middle" o:gfxdata="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" filled="f" strokecolor="#f79646 [3209]" strokeweight="3pt"/>
+              <v:rect w14:anchorId="0EDAD750" id="Rectangle 14" o:spid="_x0000_s1026" style="position:absolute;margin-left:127.45pt;margin-top:90.65pt;width:189.9pt;height:73.9pt;z-index:251664384;visibility:visible;mso-wrap-style:square;mso-wrap-distance-left:9pt;mso-wrap-distance-top:0;mso-wrap-distance-right:9pt;mso-wrap-distance-bottom:0;mso-position-horizontal:absolute;mso-position-horizontal-relative:text;mso-position-vertical:absolute;mso-position-vertical-relative:text;v-text-anchor:middle" o:gfxdata="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" filled="f" strokecolor="#f79646 [3209]" strokeweight="3pt"/>
             </w:pict>
           </mc:Fallback>
         </mc:AlternateContent>
@@ -16147,7 +16141,7 @@
           </mc:Choice>
           <mc:Fallback>
             <w:pict>
-              <v:shapetype w14:anchorId="287E1B56" id="_x0000_t88" coordsize="21600,21600" o:spt="88" adj="1800,10800" path="m,qx10800@0l10800@2qy21600@11,10800@3l10800@1qy,21600e" filled="f">
+              <v:shapetype w14:anchorId="31B4F577" id="_x0000_t88" coordsize="21600,21600" o:spt="88" adj="1800,10800" path="m,qx10800@0l10800@2qy21600@11,10800@3l10800@1qy,21600e" filled="f">
                 <v:formulas>
                   <v:f eqn="val #0"/>
                   <v:f eqn="sum 21600 0 #0"/>
@@ -16359,17 +16353,8 @@
           <w:sz w:val="22"/>
           <w:szCs w:val="22"/>
         </w:rPr>
-        <w:t>: màn hình ………</w:t>
-      </w:r>
-      <w:proofErr w:type="gramStart"/>
-      <w:r>
-        <w:rPr>
-          <w:sz w:val="22"/>
-          <w:szCs w:val="22"/>
-        </w:rPr>
-        <w:t>…..</w:t>
-      </w:r>
-      <w:proofErr w:type="gramEnd"/>
+        <w:t>: màn hình …………..</w:t>
+      </w:r>
     </w:p>
     <w:p>
       <w:pPr>
@@ -16766,13 +16751,13 @@
           <w:numId w:val="0"/>
         </w:numPr>
       </w:pPr>
-      <w:bookmarkStart w:id="71" w:name="_Toc169424254"/>
-      <w:bookmarkStart w:id="72" w:name="_Toc240195187"/>
+      <w:bookmarkStart w:id="71" w:name="_Toc240195187"/>
+      <w:bookmarkStart w:id="72" w:name="_Toc169424254"/>
       <w:r>
         <w:lastRenderedPageBreak/>
         <w:t>CHƯƠNG 5: KHỞI NGHIỆP</w:t>
       </w:r>
-      <w:bookmarkEnd w:id="72"/>
+      <w:bookmarkEnd w:id="71"/>
     </w:p>
     <w:p>
       <w:pPr>
@@ -16891,8 +16876,8 @@
           <w:szCs w:val="28"/>
         </w:rPr>
       </w:pPr>
-      <w:bookmarkStart w:id="77" w:name="_Toc162955868"/>
-      <w:bookmarkStart w:id="78" w:name="_Toc240195190"/>
+      <w:bookmarkStart w:id="77" w:name="_Toc240195190"/>
+      <w:bookmarkStart w:id="78" w:name="_Toc162955868"/>
       <w:r>
         <w:t xml:space="preserve">Dự án của </w:t>
       </w:r>
@@ -16908,7 +16893,7 @@
         </w:rPr>
         <w:t>?</w:t>
       </w:r>
-      <w:bookmarkEnd w:id="78"/>
+      <w:bookmarkEnd w:id="77"/>
     </w:p>
     <w:p>
       <w:pPr>
@@ -16935,7 +16920,7 @@
         </w:rPr>
         <w:t xml:space="preserve"> những ý tưởng mà em cho là hay, sáng tạo</w:t>
       </w:r>
-      <w:bookmarkEnd w:id="77"/>
+      <w:bookmarkEnd w:id="78"/>
       <w:r>
         <w:rPr>
           <w:rFonts w:cs="Arial"/>
@@ -16984,7 +16969,7 @@
       <w:r>
         <w:t>TÀI LIỆU THAM KHẢO</w:t>
       </w:r>
-      <w:bookmarkEnd w:id="71"/>
+      <w:bookmarkEnd w:id="72"/>
       <w:bookmarkEnd w:id="79"/>
     </w:p>
     <w:p>
@@ -17015,13 +17000,8 @@
     </w:p>
     <w:p>
       <w:r>
-        <w:t xml:space="preserve">- Tài liệu không có tên tác giả: xếp thứ tự theo bảng chữ cái đối với từ đầu tiên của tên cơ quan đã ấn hành tài liệu, ví dụ: Viện Khoa học Việt nam xếp vào vần V, Trung tâm Chọn Giống Lúa vần </w:t>
-      </w:r>
-      <w:proofErr w:type="gramStart"/>
-      <w:r>
-        <w:t>T,..</w:t>
-      </w:r>
-      <w:proofErr w:type="gramEnd"/>
+        <w:t>- Tài liệu không có tên tác giả: xếp thứ tự theo bảng chữ cái đối với từ đầu tiên của tên cơ quan đã ấn hành tài liệu, ví dụ: Viện Khoa học Việt nam xếp vào vần V, Trung tâm Chọn Giống Lúa vần T,..</w:t>
+      </w:r>
     </w:p>
     <w:p>
       <w:r>
@@ -17153,7 +17133,7 @@
           <w:noProof/>
         </w:rPr>
         <w:drawing>
-          <wp:inline distT="0" distB="0" distL="0" distR="0" wp14:anchorId="5CE39CCD" wp14:editId="5F90B553">
+          <wp:inline distT="0" distB="0" distL="0" distR="0" wp14:anchorId="5CE39CCD" wp14:editId="48EFB3D6">
             <wp:extent cx="5580380" cy="3687445"/>
             <wp:effectExtent l="0" t="0" r="0" b="0"/>
             <wp:docPr id="2" name="Picture 2" descr="A close-up of a document&#10;&#10;Description automatically generated"/>
@@ -19614,6 +19594,7 @@
   <w:style w:type="character" w:default="1" w:styleId="DefaultParagraphFont">
     <w:name w:val="Default Paragraph Font"/>
     <w:uiPriority w:val="1"/>
+    <w:semiHidden/>
     <w:unhideWhenUsed/>
   </w:style>
   <w:style w:type="table" w:default="1" w:styleId="TableNormal">

</xml_diff>